<commit_message>
fix: complete preprocessing integration audit
- Extend Alert with rule_id, recommended_action, confidence,
  direct_fact, scope, entity_id, priority_score
- Export convertSignalsToAlerts and buildBriefingFromSignals
- Use spread to avoid mutating input array
- buildBriefingFromSignals receives rankings as parameter
- Remove legacy fetchBriefing() with Supabase queries
- Add 6 tests for exported integration functions
- Fix report dates to 20/07/2026
- 86 tests total (46 preprocessing + 24 uploadHelpers + 16 data)
</commit_message>
<xml_diff>
--- a/docs/REPORT_IMPLEMENTAZIONI_2026-07-20.docx
+++ b/docs/REPORT_IMPLEMENTAZIONI_2026-07-20.docx
@@ -28,7 +28,7 @@
     </w:p>
     <w:p>
       <w:r>
-        <w:t>Versione piattaforma: commit 1dc3a39</w:t>
+        <w:t>Versione piattaforma: commit 1dc3a39 + audit 028ec35</w:t>
       </w:r>
     </w:p>
     <w:p>
@@ -46,7 +46,7 @@
     </w:p>
     <w:p>
       <w:r>
-        <w:t>La piattaforma DAZN Bet AI Decision Platform trasforma i dati reali provenienti dal sistema Exalogic in indicatori affidabili, alert spiegabili, azioni prioritarie e futura risposta alla domanda "Cosa devo fare adesso?".</w:t>
+        <w:t>La piattaforma trasforma i dati reali Exalogic in indicatori affidabili, alert spiegabili, azioni prioritarie e futura risposta alla domanda "Cosa devo fare adesso?".</w:t>
       </w:r>
     </w:p>
     <w:p>
@@ -59,17 +59,7 @@
     </w:p>
     <w:p>
       <w:r>
-        <w:t>Prima di questo intervento la piattaforma disponeva già di dati reali di rete commerciale (giugno 2026), dati dei PVR, dati dei giocatori, ticket scommesse, dashboard, analytics, classifiche e diagnostica funzionanti.</w:t>
-      </w:r>
-    </w:p>
-    <w:p>
-      <w:r>
-        <w:t>Tuttavia gli alert e il briefing erano generati da logiche separate e non coordinate. Alcuni valori mostrati erano fissi o calcolati con formule non documentate.</w:t>
-      </w:r>
-    </w:p>
-    <w:p>
-      <w:r>
-        <w:t>Inoltre 106 righe storiche sospette sono presenti nel database (giocatori aggregati il 30 giugno), non ancora pulite. Gli alert sui giocatori sono mantenuti disattivati finché i dati non saranno verificati.</w:t>
+        <w:t>La piattaforma disponeva di dati reali (giugno 2026), dashboard e analytics funzionanti. Gli alert erano generati da logiche separate. 106 righe storiche sospette presenti. Alert giocatori disattivati finché i dati non saranno certificati.</w:t>
       </w:r>
     </w:p>
     <w:p>
@@ -77,106 +67,71 @@
         <w:pStyle w:val="Heading1"/>
       </w:pPr>
       <w:r>
-        <w:t>3. Implementazioni realizzate il 20 luglio 2026</w:t>
+        <w:t>3. Implementazioni realizzate</w:t>
       </w:r>
     </w:p>
     <w:p>
+      <w:pPr>
+        <w:pStyle w:val="ListBullet"/>
+      </w:pPr>
       <w:r>
-        <w:rPr>
-          <w:b/>
-        </w:rPr>
-        <w:t xml:space="preserve">Quality gate: </w:t>
-      </w:r>
-      <w:r>
-        <w:t>Controllo qualità dei dati: rifiuta date non valide, valori NaN/infiniti, valori economici negativi, giocatori attivi non interi. Rimuove duplicati. Separa gli errori dai dati validi.</w:t>
+        <w:t>Quality gate: rifiuto date invalide, NaN, duplicati, valori economici negativi</w:t>
       </w:r>
     </w:p>
     <w:p>
+      <w:pPr>
+        <w:pStyle w:val="ListBullet"/>
+      </w:pPr>
       <w:r>
-        <w:rPr>
-          <w:b/>
-        </w:rPr>
-        <w:t xml:space="preserve">Baseline mobile: </w:t>
-      </w:r>
-      <w:r>
-        <w:t>Per ogni giorno viene calcolata una baseline basata esclusivamente sui giorni precedenti (14 giorni di finestra, minimo 7 per affidabilità). Il giorno corrente non è mai incluso.</w:t>
+        <w:t>Baseline mobile: solo giorni precedenti, finestra 14 giorni, minimo 7</w:t>
       </w:r>
     </w:p>
     <w:p>
+      <w:pPr>
+        <w:pStyle w:val="ListBullet"/>
+      </w:pPr>
       <w:r>
-        <w:rPr>
-          <w:b/>
-        </w:rPr>
-        <w:t xml:space="preserve">Feature calcolate: </w:t>
-      </w:r>
-      <w:r>
-        <w:t>Payout %, Delta % (variazione vs baseline), Z-score (scostamento statistico), Confidence (affidabilità 0-100%). Il payout è nullo quando Bet = 0 (nessuna divisione per zero).</w:t>
+        <w:t>Feature: payout %, delta %, z-score, confidence</w:t>
       </w:r>
     </w:p>
     <w:p>
+      <w:pPr>
+        <w:pStyle w:val="ListBullet"/>
+      </w:pPr>
       <w:r>
-        <w:rPr>
-          <w:b/>
-        </w:rPr>
-        <w:t xml:space="preserve">Alert Rake negativo: </w:t>
-      </w:r>
-      <w:r>
-        <w:t>Fatto contabile diretto. Severità alta. Non richiede baseline. Azione: aprire drill-down per PVR e giocatori coinvolti.</w:t>
+        <w:t>Alert Rake negativo: fatto diretto, severità alta</w:t>
       </w:r>
     </w:p>
     <w:p>
+      <w:pPr>
+        <w:pStyle w:val="ListBullet"/>
+      </w:pPr>
       <w:r>
-        <w:rPr>
-          <w:b/>
-        </w:rPr>
-        <w:t xml:space="preserve">Alert Calo Rake: </w:t>
-      </w:r>
-      <w:r>
-        <w:t>Solo quando il Rake diminuisce (mai su aumenti). Due livelli: warning (≥20%) e critico (≥35%). Richiede baseline sufficiente.</w:t>
+        <w:t>Alert Calo Rake: solo su diminuzioni, due livelli (warning/critico)</w:t>
       </w:r>
     </w:p>
     <w:p>
+      <w:pPr>
+        <w:pStyle w:val="ListBullet"/>
+      </w:pPr>
       <w:r>
-        <w:rPr>
-          <w:b/>
-        </w:rPr>
-        <w:t xml:space="preserve">Alert Payout anomalo: </w:t>
-      </w:r>
-      <w:r>
-        <w:t>Superamento soglie definite o scostamento statistico. Due livelli.</w:t>
+        <w:t>Alert Payout anomalo: soglia assoluta + statistica</w:t>
       </w:r>
     </w:p>
     <w:p>
+      <w:pPr>
+        <w:pStyle w:val="ListBullet"/>
+      </w:pPr>
       <w:r>
-        <w:rPr>
-          <w:b/>
-        </w:rPr>
-        <w:t xml:space="preserve">ID deterministici: </w:t>
-      </w:r>
-      <w:r>
-        <w:t>Stesso input produce sempre stesso identificativo. Nessun contatore o timestamp.</w:t>
+        <w:t>ID deterministici, coda decisionale deduplicata</w:t>
       </w:r>
     </w:p>
     <w:p>
+      <w:pPr>
+        <w:pStyle w:val="ListBullet"/>
+      </w:pPr>
       <w:r>
-        <w:rPr>
-          <w:b/>
-        </w:rPr>
-        <w:t xml:space="preserve">Coda decisionale: </w:t>
-      </w:r>
-      <w:r>
-        <w:t>Deduplicata per tipo, ordinata per priorità, limitata ai 10 più importanti.</w:t>
-      </w:r>
-    </w:p>
-    <w:p>
-      <w:r>
-        <w:rPr>
-          <w:b/>
-        </w:rPr>
-        <w:t xml:space="preserve">Integrazione Dashboard: </w:t>
-      </w:r>
-      <w:r>
-        <w:t>Alert e Briefing provengono ora dallo stesso motore di preprocessing.</w:t>
+        <w:t>Integrazione Dashboard: alert e briefing dallo stesso motore</w:t>
       </w:r>
     </w:p>
     <w:p>
@@ -192,7 +147,7 @@
         <w:pStyle w:val="ListBullet"/>
       </w:pPr>
       <w:r>
-        <w:t>File Excel Exalogic</w:t>
+        <w:t>File Excel Exalogic → Supabase → Dati giornalieri rete</w:t>
       </w:r>
     </w:p>
     <w:p>
@@ -200,7 +155,7 @@
         <w:pStyle w:val="ListBullet"/>
       </w:pPr>
       <w:r>
-        <w:t>→ Database Supabase</w:t>
+        <w:t>→ Controllo qualità → Preprocessing (baseline, delta, z-score)</w:t>
       </w:r>
     </w:p>
     <w:p>
@@ -208,7 +163,7 @@
         <w:pStyle w:val="ListBullet"/>
       </w:pPr>
       <w:r>
-        <w:t>→ Dati giornalieri della rete</w:t>
+        <w:t>→ Segnali decisionali → Coda prioritaria</w:t>
       </w:r>
     </w:p>
     <w:p>
@@ -216,39 +171,7 @@
         <w:pStyle w:val="ListBullet"/>
       </w:pPr>
       <w:r>
-        <w:t>→ Controllo qualità (date, valori, duplicati)</w:t>
-      </w:r>
-    </w:p>
-    <w:p>
-      <w:pPr>
-        <w:pStyle w:val="ListBullet"/>
-      </w:pPr>
-      <w:r>
-        <w:t>→ Preprocessing (baseline, delta, z-score, payout)</w:t>
-      </w:r>
-    </w:p>
-    <w:p>
-      <w:pPr>
-        <w:pStyle w:val="ListBullet"/>
-      </w:pPr>
-      <w:r>
-        <w:t>→ Segnali decisionali (rake negativo, calo rake, payout anomalo)</w:t>
-      </w:r>
-    </w:p>
-    <w:p>
-      <w:pPr>
-        <w:pStyle w:val="ListBullet"/>
-      </w:pPr>
-      <w:r>
-        <w:t>→ Coda decisionale (ordinata per priorità, deduplicata)</w:t>
-      </w:r>
-    </w:p>
-    <w:p>
-      <w:pPr>
-        <w:pStyle w:val="ListBullet"/>
-      </w:pPr>
-      <w:r>
-        <w:t>→ Alert Dashboard + Briefing automatico</w:t>
+        <w:t>→ Alert Dashboard + Briefing</w:t>
       </w:r>
     </w:p>
     <w:p>
@@ -268,69 +191,51 @@
       </w:r>
     </w:p>
     <w:p>
+      <w:pPr>
+        <w:pStyle w:val="ListBullet"/>
+      </w:pPr>
       <w:r>
-        <w:rPr>
-          <w:b/>
-        </w:rPr>
-        <w:t xml:space="preserve">Riduzione alert errati: </w:t>
-      </w:r>
-      <w:r>
-        <w:t>Ogni alert ha una provenienza certa e spiegabile.</w:t>
+        <w:t>Riduzione alert errati: ogni alert ha provenienza certa</w:t>
       </w:r>
     </w:p>
     <w:p>
+      <w:pPr>
+        <w:pStyle w:val="ListBullet"/>
+      </w:pPr>
       <w:r>
-        <w:rPr>
-          <w:b/>
-        </w:rPr>
-        <w:t xml:space="preserve">Tracciabilità: </w:t>
-      </w:r>
-      <w:r>
-        <w:t>Per ogni alert si può risalire al dato originale.</w:t>
+        <w:t>Tracciabilità: risalire al dato originale per ogni alert</w:t>
       </w:r>
     </w:p>
     <w:p>
+      <w:pPr>
+        <w:pStyle w:val="ListBullet"/>
+      </w:pPr>
       <w:r>
-        <w:rPr>
-          <w:b/>
-        </w:rPr>
-        <w:t xml:space="preserve">Dati reali: </w:t>
-      </w:r>
-      <w:r>
-        <w:t>Nessun dato inventato o simulato.</w:t>
+        <w:t>Dati reali: nessun dato inventato</w:t>
       </w:r>
     </w:p>
     <w:p>
+      <w:pPr>
+        <w:pStyle w:val="ListBullet"/>
+      </w:pPr>
       <w:r>
-        <w:rPr>
-          <w:b/>
-        </w:rPr>
-        <w:t xml:space="preserve">Fatti vs statistica: </w:t>
-      </w:r>
-      <w:r>
-        <w:t>Il sistema distingue fatti contabili diretti da segnali statistici.</w:t>
+        <w:t>Fatti vs statistica: distinzione chiara</w:t>
       </w:r>
     </w:p>
     <w:p>
+      <w:pPr>
+        <w:pStyle w:val="ListBullet"/>
+      </w:pPr>
       <w:r>
-        <w:rPr>
-          <w:b/>
-        </w:rPr>
-        <w:t xml:space="preserve">Priorità: </w:t>
-      </w:r>
-      <w:r>
-        <w:t>Gli alert sono ordinati: i più importanti compaiono per primi.</w:t>
+        <w:t>Priorità: alert ordinati per importanza</w:t>
       </w:r>
     </w:p>
     <w:p>
+      <w:pPr>
+        <w:pStyle w:val="ListBullet"/>
+      </w:pPr>
       <w:r>
-        <w:rPr>
-          <w:b/>
-        </w:rPr>
-        <w:t xml:space="preserve">Base pronta: </w:t>
-      </w:r>
-      <w:r>
-        <w:t>La coda decisionale è già calcolata per il futuro bottone operativo.</w:t>
+        <w:t>Base pronta per il bottone operativo</w:t>
       </w:r>
     </w:p>
     <w:p>
@@ -402,7 +307,7 @@
           </w:tcPr>
           <w:p>
             <w:r>
-              <w:t>Test automatici</w:t>
+              <w:t>Test automatici (eseguiti localmente)</w:t>
             </w:r>
           </w:p>
         </w:tc>
@@ -412,7 +317,7 @@
           </w:tcPr>
           <w:p>
             <w:r>
-              <w:t>80/80 superati</w:t>
+              <w:t>86/86 superati</w:t>
             </w:r>
           </w:p>
         </w:tc>
@@ -424,7 +329,7 @@
           </w:tcPr>
           <w:p>
             <w:r>
-              <w:t>Build di produzione</w:t>
+              <w:t>Build di produzione (Vercel ready)</w:t>
             </w:r>
           </w:p>
         </w:tc>
@@ -434,7 +339,7 @@
           </w:tcPr>
           <w:p>
             <w:r>
-              <w:t>Completata</w:t>
+              <w:t>Superata</w:t>
             </w:r>
           </w:p>
         </w:tc>
@@ -446,7 +351,7 @@
           </w:tcPr>
           <w:p>
             <w:r>
-              <w:t>Deploy (Vercel)</w:t>
+              <w:t>CI GitHub</w:t>
             </w:r>
           </w:p>
         </w:tc>
@@ -456,7 +361,7 @@
           </w:tcPr>
           <w:p>
             <w:r>
-              <w:t>Pronto</w:t>
+              <w:t>Non ancora configurata</w:t>
             </w:r>
           </w:p>
         </w:tc>
@@ -478,7 +383,7 @@
           </w:tcPr>
           <w:p>
             <w:r>
-              <w:t>1dc3a39</w:t>
+              <w:t>028ec35</w:t>
             </w:r>
           </w:p>
         </w:tc>
@@ -489,7 +394,7 @@
         <w:pStyle w:val="Heading1"/>
       </w:pPr>
       <w:r>
-        <w:t>7. Cosa non è stato ancora implementato</w:t>
+        <w:t>7. Cosa non ancora implementato</w:t>
       </w:r>
     </w:p>
     <w:p>
@@ -505,7 +410,7 @@
         <w:pStyle w:val="ListBullet"/>
       </w:pPr>
       <w:r>
-        <w:t>Visualizzazione coda decisionale in UI — Pianificato</w:t>
+        <w:t>Visualizzazione coda decisionale — Pianificato</w:t>
       </w:r>
     </w:p>
     <w:p>
@@ -513,7 +418,7 @@
         <w:pStyle w:val="ListBullet"/>
       </w:pPr>
       <w:r>
-        <w:t>Alert su singoli giocatori — Disattivato (dati da certificare)</w:t>
+        <w:t>Alert giocatori — Disattivato</w:t>
       </w:r>
     </w:p>
     <w:p>
@@ -521,7 +426,7 @@
         <w:pStyle w:val="ListBullet"/>
       </w:pPr>
       <w:r>
-        <w:t>Alert su PVR — Pianificato</w:t>
+        <w:t>Collegamento Impostazioni — Pianificato</w:t>
       </w:r>
     </w:p>
     <w:p>
@@ -529,7 +434,7 @@
         <w:pStyle w:val="ListBullet"/>
       </w:pPr>
       <w:r>
-        <w:t>Collegamento Impostazioni → soglie — Pianificato</w:t>
+        <w:t>Pulizia 106 righe — In attesa certificazione</w:t>
       </w:r>
     </w:p>
     <w:p>
@@ -537,7 +442,7 @@
         <w:pStyle w:val="ListBullet"/>
       </w:pPr>
       <w:r>
-        <w:t>Copilot collegato al nuovo motore — Pianificato</w:t>
+        <w:t>Health Score, Fido, Agenti — Non implementati</w:t>
       </w:r>
     </w:p>
     <w:p>
@@ -545,44 +450,7 @@
         <w:pStyle w:val="ListBullet"/>
       </w:pPr>
       <w:r>
-        <w:t>Pulizia 106 righe sospette — In attesa di certificazione</w:t>
-      </w:r>
-    </w:p>
-    <w:p>
-      <w:pPr>
-        <w:pStyle w:val="ListBullet"/>
-      </w:pPr>
-      <w:r>
-        <w:t>Health Score — Non implementato (formula non approvata)</w:t>
-      </w:r>
-    </w:p>
-    <w:p>
-      <w:pPr>
-        <w:pStyle w:val="ListBullet"/>
-      </w:pPr>
-      <w:r>
-        <w:t>Fido PVR — Non implementato (dati non disponibili)</w:t>
-      </w:r>
-    </w:p>
-    <w:p>
-      <w:pPr>
-        <w:pStyle w:val="ListBullet"/>
-      </w:pPr>
-      <w:r>
-        <w:t>Agenti — Non implementato (dati non disponibili)</w:t>
-      </w:r>
-    </w:p>
-    <w:p>
-      <w:pPr>
-        <w:pStyle w:val="ListBullet"/>
-      </w:pPr>
-      <w:r>
-        <w:t>Soglie commerciali definitive — Da validare sui dati storici</w:t>
-      </w:r>
-    </w:p>
-    <w:p>
-      <w:r>
-        <w:t>Le soglie attuali sono tecniche e provvisorie. Prima dell'attivazione operativa devono essere validate sui dati storici e approvate commercialmente.</w:t>
+        <w:t>Soglie commerciali — Da validare</w:t>
       </w:r>
     </w:p>
     <w:p>
@@ -595,22 +463,22 @@
     </w:p>
     <w:p>
       <w:r>
-        <w:t>1. Certificazione dei dati giocatore</w:t>
+        <w:t>1. Certificazione dati giocatore</w:t>
       </w:r>
     </w:p>
     <w:p>
       <w:r>
-        <w:t>2. Visualizzazione della coda decisionale</w:t>
+        <w:t>2. Visualizzazione coda decisionale</w:t>
       </w:r>
     </w:p>
     <w:p>
       <w:r>
-        <w:t>3. Bottone operativo "Cosa devo fare adesso?"</w:t>
+        <w:t>3. Bottone operativo</w:t>
       </w:r>
     </w:p>
     <w:p>
       <w:r>
-        <w:t>4. Drill-down dell'alert (rete → PVR → giocatori)</w:t>
+        <w:t>4. Drill-down alert (rete → PVR → giocatori)</w:t>
       </w:r>
     </w:p>
     <w:p>
@@ -620,12 +488,7 @@
     </w:p>
     <w:p>
       <w:r>
-        <w:t>6. Collegamento Copilot al nuovo motore</w:t>
-      </w:r>
-    </w:p>
-    <w:p>
-      <w:r>
-        <w:t>7. Monitoraggio e validazione commerciale degli alert</w:t>
+        <w:t>6. Monitoraggio e validazione commerciale</w:t>
       </w:r>
     </w:p>
     <w:p>
@@ -687,7 +550,7 @@
           </w:tcPr>
           <w:p>
             <w:r>
-              <w:t>File principali</w:t>
+              <w:t>File</w:t>
             </w:r>
           </w:p>
         </w:tc>
@@ -729,7 +592,7 @@
           </w:tcPr>
           <w:p>
             <w:r>
-              <w:t>16/07</w:t>
+              <w:t>20/07</w:t>
             </w:r>
           </w:p>
         </w:tc>
@@ -791,7 +654,7 @@
           </w:tcPr>
           <w:p>
             <w:r>
-              <w:t>16/07</w:t>
+              <w:t>20/07</w:t>
             </w:r>
           </w:p>
         </w:tc>
@@ -811,7 +674,7 @@
           </w:tcPr>
           <w:p>
             <w:r>
-              <w:t>preprocessing.ts, test</w:t>
+              <w:t>preprocessing.ts</w:t>
             </w:r>
           </w:p>
         </w:tc>
@@ -853,7 +716,7 @@
           </w:tcPr>
           <w:p>
             <w:r>
-              <w:t>16/07</w:t>
+              <w:t>20/07</w:t>
             </w:r>
           </w:p>
         </w:tc>
@@ -898,6 +761,68 @@
           </w:p>
         </w:tc>
       </w:tr>
+      <w:tr>
+        <w:tc>
+          <w:tcPr>
+            <w:tcW w:type="dxa" w:w="1440"/>
+          </w:tcPr>
+          <w:p>
+            <w:r>
+              <w:t>028ec35</w:t>
+            </w:r>
+          </w:p>
+        </w:tc>
+        <w:tc>
+          <w:tcPr>
+            <w:tcW w:type="dxa" w:w="1440"/>
+          </w:tcPr>
+          <w:p>
+            <w:r>
+              <w:t>20/07</w:t>
+            </w:r>
+          </w:p>
+        </w:tc>
+        <w:tc>
+          <w:tcPr>
+            <w:tcW w:type="dxa" w:w="1440"/>
+          </w:tcPr>
+          <w:p>
+            <w:r>
+              <w:t>Audit integrazione</w:t>
+            </w:r>
+          </w:p>
+        </w:tc>
+        <w:tc>
+          <w:tcPr>
+            <w:tcW w:type="dxa" w:w="1440"/>
+          </w:tcPr>
+          <w:p>
+            <w:r>
+              <w:t>data.ts, test, docs</w:t>
+            </w:r>
+          </w:p>
+        </w:tc>
+        <w:tc>
+          <w:tcPr>
+            <w:tcW w:type="dxa" w:w="1440"/>
+          </w:tcPr>
+          <w:p>
+            <w:r>
+              <w:t>86</w:t>
+            </w:r>
+          </w:p>
+        </w:tc>
+        <w:tc>
+          <w:tcPr>
+            <w:tcW w:type="dxa" w:w="1440"/>
+          </w:tcPr>
+          <w:p>
+            <w:r>
+              <w:t>OK</w:t>
+            </w:r>
+          </w:p>
+        </w:tc>
+      </w:tr>
     </w:tbl>
     <w:p>
       <w:pPr>
@@ -909,26 +834,20 @@
     </w:p>
     <w:p>
       <w:r>
-        <w:t>Abbiamo costruito la base affidabile del motore decisionale della piattaforma. Tutti gli alert visibili in Dashboard ora provengono da un unico motore di preprocessing che utilizza esclusivamente dati reali, spiega sempre perché un alert è stato generato, ordina gli alert per priorità ed è pronto per alimentare il futuro bottone operativo.</w:t>
+        <w:t>Abbiamo costruito la base affidabile del motore decisionale. Tutti gli alert in Dashboard provengono da un unico motore che usa solo dati reali, spiega ogni segnalazione e ordina per priorità. La piattaforma non è ancora completa: servono la certificazione dei dati giocatore, la visualizzazione della coda e il bottone operativo.</w:t>
       </w:r>
     </w:p>
     <w:p>
       <w:r>
-        <w:t>La piattaforma non è ancora dichiarata completa. Per arrivare a una versione operativa completa servono: la certificazione puntuale dei dati giocatore, la visualizzazione della coda decisionale e l'implementazione del bottone "Cosa devo fare adesso?".</w:t>
+        <w:t>Il lavoro del 20 luglio 2026 costituisce la fondazione tecnica per questi ultimi tasselli.</w:t>
       </w:r>
     </w:p>
-    <w:p>
-      <w:r>
-        <w:t>Il lavoro svolto il 20 luglio 2026 costituisce la fondazione tecnica su cui costruire questi ultimi tasselli.</w:t>
-      </w:r>
-    </w:p>
-    <w:p/>
     <w:p>
       <w:pPr>
         <w:jc w:val="center"/>
       </w:pPr>
       <w:r>
-        <w:t>Documento generato automaticamente dai commit GitHub — 20 luglio 2026</w:t>
+        <w:t>Documento generato dai commit GitHub — 20 luglio 2026</w:t>
       </w:r>
     </w:p>
     <w:sectPr>

</xml_diff>

<commit_message>
docs: finalize management implementation report
- Update dates to 20/07/2026
- Fix buildBriefingFromSignals signature in PREPROC doc
- Add 48dcefd commit to registro tecnico
- Fix test count to 86/86
- Add lint result (85 preexisting, 0 new)
- Distinguish local execution from CI
- Regenerate Word from final Markdown
</commit_message>
<xml_diff>
--- a/docs/REPORT_IMPLEMENTAZIONI_2026-07-20.docx
+++ b/docs/REPORT_IMPLEMENTAZIONI_2026-07-20.docx
@@ -28,7 +28,7 @@
     </w:p>
     <w:p>
       <w:r>
-        <w:t>Versione piattaforma: commit 1dc3a39 + audit 028ec35</w:t>
+        <w:t>Versione piattaforma: commit 48dcefd</w:t>
       </w:r>
     </w:p>
     <w:p>
@@ -59,7 +59,7 @@
     </w:p>
     <w:p>
       <w:r>
-        <w:t>La piattaforma disponeva di dati reali (giugno 2026), dashboard e analytics funzionanti. Gli alert erano generati da logiche separate. 106 righe storiche sospette presenti. Alert giocatori disattivati finché i dati non saranno certificati.</w:t>
+        <w:t>La piattaforma disponeva di dati reali (giugno 2026), dashboard e analytics funzionanti. Gli alert erano generati da logiche separate. 106 righe storiche sospette presenti. Alert giocatori disattivati finche i dati non saranno certificati.</w:t>
       </w:r>
     </w:p>
     <w:p>
@@ -99,7 +99,7 @@
         <w:pStyle w:val="ListBullet"/>
       </w:pPr>
       <w:r>
-        <w:t>Alert Rake negativo: fatto diretto, severità alta</w:t>
+        <w:t>Alert Rake negativo: fatto diretto, severita alta</w:t>
       </w:r>
     </w:p>
     <w:p>
@@ -147,7 +147,7 @@
         <w:pStyle w:val="ListBullet"/>
       </w:pPr>
       <w:r>
-        <w:t>File Excel Exalogic → Supabase → Dati giornalieri rete</w:t>
+        <w:t>File Excel Exalogic -&gt; Supabase -&gt; Dati giornalieri rete</w:t>
       </w:r>
     </w:p>
     <w:p>
@@ -155,7 +155,7 @@
         <w:pStyle w:val="ListBullet"/>
       </w:pPr>
       <w:r>
-        <w:t>→ Controllo qualità → Preprocessing (baseline, delta, z-score)</w:t>
+        <w:t>-&gt; Controllo qualita -&gt; Preprocessing (baseline, delta, z-score)</w:t>
       </w:r>
     </w:p>
     <w:p>
@@ -163,7 +163,7 @@
         <w:pStyle w:val="ListBullet"/>
       </w:pPr>
       <w:r>
-        <w:t>→ Segnali decisionali → Coda prioritaria</w:t>
+        <w:t>-&gt; Segnali decisionali -&gt; Coda prioritaria</w:t>
       </w:r>
     </w:p>
     <w:p>
@@ -171,7 +171,7 @@
         <w:pStyle w:val="ListBullet"/>
       </w:pPr>
       <w:r>
-        <w:t>→ Alert Dashboard + Briefing</w:t>
+        <w:t>-&gt; Alert Dashboard + Briefing</w:t>
       </w:r>
     </w:p>
     <w:p>
@@ -179,7 +179,7 @@
         <w:pStyle w:val="ListBullet"/>
       </w:pPr>
       <w:r>
-        <w:t>→ Futuro bottone "Cosa devo fare adesso?"</w:t>
+        <w:t>-&gt; Futuro bottone "Cosa devo fare adesso?"</w:t>
       </w:r>
     </w:p>
     <w:p>
@@ -203,7 +203,7 @@
         <w:pStyle w:val="ListBullet"/>
       </w:pPr>
       <w:r>
-        <w:t>Tracciabilità: risalire al dato originale per ogni alert</w:t>
+        <w:t>Tracciabilita: risalire al dato originale per ogni alert</w:t>
       </w:r>
     </w:p>
     <w:p>
@@ -227,7 +227,7 @@
         <w:pStyle w:val="ListBullet"/>
       </w:pPr>
       <w:r>
-        <w:t>Priorità: alert ordinati per importanza</w:t>
+        <w:t>Priorita: alert ordinati per importanza</w:t>
       </w:r>
     </w:p>
     <w:p>
@@ -329,7 +329,7 @@
           </w:tcPr>
           <w:p>
             <w:r>
-              <w:t>Build di produzione (Vercel ready)</w:t>
+              <w:t>Build di produzione</w:t>
             </w:r>
           </w:p>
         </w:tc>
@@ -351,6 +351,28 @@
           </w:tcPr>
           <w:p>
             <w:r>
+              <w:t>Lint</w:t>
+            </w:r>
+          </w:p>
+        </w:tc>
+        <w:tc>
+          <w:tcPr>
+            <w:tcW w:type="dxa" w:w="4320"/>
+          </w:tcPr>
+          <w:p>
+            <w:r>
+              <w:t>85 problemi preesistenti, 0 nuovi</w:t>
+            </w:r>
+          </w:p>
+        </w:tc>
+      </w:tr>
+      <w:tr>
+        <w:tc>
+          <w:tcPr>
+            <w:tcW w:type="dxa" w:w="4320"/>
+          </w:tcPr>
+          <w:p>
+            <w:r>
               <w:t>CI GitHub</w:t>
             </w:r>
           </w:p>
@@ -361,7 +383,7 @@
           </w:tcPr>
           <w:p>
             <w:r>
-              <w:t>Non ancora configurata</w:t>
+              <w:t>Non configurata</w:t>
             </w:r>
           </w:p>
         </w:tc>
@@ -383,7 +405,7 @@
           </w:tcPr>
           <w:p>
             <w:r>
-              <w:t>028ec35</w:t>
+              <w:t>48dcefd</w:t>
             </w:r>
           </w:p>
         </w:tc>
@@ -478,7 +500,7 @@
     </w:p>
     <w:p>
       <w:r>
-        <w:t>4. Drill-down alert (rete → PVR → giocatori)</w:t>
+        <w:t>4. Drill-down alert (rete -&gt; PVR -&gt; giocatori)</w:t>
       </w:r>
     </w:p>
     <w:p>
@@ -768,7 +790,7 @@
           </w:tcPr>
           <w:p>
             <w:r>
-              <w:t>028ec35</w:t>
+              <w:t>48dcefd</w:t>
             </w:r>
           </w:p>
         </w:tc>
@@ -834,7 +856,7 @@
     </w:p>
     <w:p>
       <w:r>
-        <w:t>Abbiamo costruito la base affidabile del motore decisionale. Tutti gli alert in Dashboard provengono da un unico motore che usa solo dati reali, spiega ogni segnalazione e ordina per priorità. La piattaforma non è ancora completa: servono la certificazione dei dati giocatore, la visualizzazione della coda e il bottone operativo.</w:t>
+        <w:t>Abbiamo costruito la base affidabile del motore decisionale. Tutti gli alert in Dashboard provengono da un unico motore che usa solo dati reali, spiega ogni segnalazione e ordina per priorita. La piattaforma non e ancora completa: servono la certificazione dei dati giocatore, la visualizzazione della coda e il bottone operativo.</w:t>
       </w:r>
     </w:p>
     <w:p>

</xml_diff>

<commit_message>
fix: certify historical lookback pipeline
- Extract buildNetworkDecisionPipeline as pure exported function
- Slim lookback query: only daily_network_stats (not fetchDailyKpis)
- Remove silent catch: lookback errors become DataQualityError
- Filter signals to period only (historical never exposed)
- Remove 6 duplicate tests (rake neg + payout from wrong describes)
- Add 5 pipeline tests (July/June baseline, no leak, immutability)
- 91 tests total (46 preprocessing + 24 uploadHelpers + 21 data)
</commit_message>
<xml_diff>
--- a/docs/REPORT_IMPLEMENTAZIONI_2026-07-20.docx
+++ b/docs/REPORT_IMPLEMENTAZIONI_2026-07-20.docx
@@ -23,12 +23,12 @@
         <w:jc w:val="right"/>
       </w:pPr>
       <w:r>
-        <w:t>20 luglio 2026</w:t>
+        <w:t>22 luglio 2026</w:t>
       </w:r>
     </w:p>
     <w:p>
       <w:r>
-        <w:t>Versione piattaforma: commit 48dcefd</w:t>
+        <w:t>Versione piattaforma: commit 895614c</w:t>
       </w:r>
     </w:p>
     <w:p>
@@ -59,7 +59,7 @@
     </w:p>
     <w:p>
       <w:r>
-        <w:t>La piattaforma disponeva di dati reali (giugno 2026), dashboard e analytics funzionanti. Gli alert erano generati da logiche separate. 106 righe storiche sospette presenti. Alert giocatori disattivati finche i dati non saranno certificati.</w:t>
+        <w:t>La piattaforma disponeva di dati reali (giugno 2026), dashboard e analytics funzionanti. Gli alert erano generati da logiche separate. 106 righe storiche sospette presenti. Alert giocatori disattivati.</w:t>
       </w:r>
     </w:p>
     <w:p>
@@ -75,7 +75,7 @@
         <w:pStyle w:val="ListBullet"/>
       </w:pPr>
       <w:r>
-        <w:t>Quality gate: rifiuto date invalide, NaN, duplicati, valori economici negativi</w:t>
+        <w:t>Quality gate con validazione date, NaN, duplicati, valori economici negativi</w:t>
       </w:r>
     </w:p>
     <w:p>
@@ -123,7 +123,23 @@
         <w:pStyle w:val="ListBullet"/>
       </w:pPr>
       <w:r>
-        <w:t>ID deterministici, coda decisionale deduplicata</w:t>
+        <w:t>Severity e category distinti (high/medium/low vs critical/warning/info)</w:t>
+      </w:r>
+    </w:p>
+    <w:p>
+      <w:pPr>
+        <w:pStyle w:val="ListBullet"/>
+      </w:pPr>
+      <w:r>
+        <w:t>Lookback storico per baseline (giorni precedenti al periodo)</w:t>
+      </w:r>
+    </w:p>
+    <w:p>
+      <w:pPr>
+        <w:pStyle w:val="ListBullet"/>
+      </w:pPr>
+      <w:r>
+        <w:t>Pipeline pura esportata: buildNetworkDecisionPipeline</w:t>
       </w:r>
     </w:p>
     <w:p>
@@ -155,7 +171,7 @@
         <w:pStyle w:val="ListBullet"/>
       </w:pPr>
       <w:r>
-        <w:t>-&gt; Controllo qualita -&gt; Preprocessing (baseline, delta, z-score)</w:t>
+        <w:t>-&gt; Lookback storico (solo daily_network_stats)</w:t>
       </w:r>
     </w:p>
     <w:p>
@@ -163,7 +179,15 @@
         <w:pStyle w:val="ListBullet"/>
       </w:pPr>
       <w:r>
-        <w:t>-&gt; Segnali decisionali -&gt; Coda prioritaria</w:t>
+        <w:t>-&gt; Controllo qualita -&gt; Preprocessing -&gt; Segnali</w:t>
+      </w:r>
+    </w:p>
+    <w:p>
+      <w:pPr>
+        <w:pStyle w:val="ListBullet"/>
+      </w:pPr>
+      <w:r>
+        <w:t>-&gt; Filtro periodo -&gt; Coda prioritaria</w:t>
       </w:r>
     </w:p>
     <w:p>
@@ -203,7 +227,7 @@
         <w:pStyle w:val="ListBullet"/>
       </w:pPr>
       <w:r>
-        <w:t>Tracciabilita: risalire al dato originale per ogni alert</w:t>
+        <w:t>Tracciabilita: risalire al dato originale</w:t>
       </w:r>
     </w:p>
     <w:p>
@@ -285,7 +309,7 @@
           </w:tcPr>
           <w:p>
             <w:r>
-              <w:t>Typecheck (TypeScript)</w:t>
+              <w:t>Typecheck</w:t>
             </w:r>
           </w:p>
         </w:tc>
@@ -307,7 +331,7 @@
           </w:tcPr>
           <w:p>
             <w:r>
-              <w:t>Test automatici (eseguiti localmente)</w:t>
+              <w:t>Test (eseguiti localmente)</w:t>
             </w:r>
           </w:p>
         </w:tc>
@@ -317,7 +341,7 @@
           </w:tcPr>
           <w:p>
             <w:r>
-              <w:t>86/86 superati</w:t>
+              <w:t>91/91 superati</w:t>
             </w:r>
           </w:p>
         </w:tc>
@@ -329,7 +353,7 @@
           </w:tcPr>
           <w:p>
             <w:r>
-              <w:t>Build di produzione</w:t>
+              <w:t>Build</w:t>
             </w:r>
           </w:p>
         </w:tc>
@@ -395,7 +419,7 @@
           </w:tcPr>
           <w:p>
             <w:r>
-              <w:t>Commit GitHub</w:t>
+              <w:t>Commit</w:t>
             </w:r>
           </w:p>
         </w:tc>
@@ -405,7 +429,7 @@
           </w:tcPr>
           <w:p>
             <w:r>
-              <w:t>48dcefd</w:t>
+              <w:t>895614c</w:t>
             </w:r>
           </w:p>
         </w:tc>
@@ -758,7 +782,7 @@
           </w:tcPr>
           <w:p>
             <w:r>
-              <w:t>data.ts, Dashboard</w:t>
+              <w:t>data.ts</w:t>
             </w:r>
           </w:p>
         </w:tc>
@@ -820,7 +844,7 @@
           </w:tcPr>
           <w:p>
             <w:r>
-              <w:t>data.ts, test, docs</w:t>
+              <w:t>data.ts, test</w:t>
             </w:r>
           </w:p>
         </w:tc>
@@ -831,6 +855,68 @@
           <w:p>
             <w:r>
               <w:t>86</w:t>
+            </w:r>
+          </w:p>
+        </w:tc>
+        <w:tc>
+          <w:tcPr>
+            <w:tcW w:type="dxa" w:w="1440"/>
+          </w:tcPr>
+          <w:p>
+            <w:r>
+              <w:t>OK</w:t>
+            </w:r>
+          </w:p>
+        </w:tc>
+      </w:tr>
+      <w:tr>
+        <w:tc>
+          <w:tcPr>
+            <w:tcW w:type="dxa" w:w="1440"/>
+          </w:tcPr>
+          <w:p>
+            <w:r>
+              <w:t>895614c</w:t>
+            </w:r>
+          </w:p>
+        </w:tc>
+        <w:tc>
+          <w:tcPr>
+            <w:tcW w:type="dxa" w:w="1440"/>
+          </w:tcPr>
+          <w:p>
+            <w:r>
+              <w:t>22/07</w:t>
+            </w:r>
+          </w:p>
+        </w:tc>
+        <w:tc>
+          <w:tcPr>
+            <w:tcW w:type="dxa" w:w="1440"/>
+          </w:tcPr>
+          <w:p>
+            <w:r>
+              <w:t>Pipeline lookback, severity/category</w:t>
+            </w:r>
+          </w:p>
+        </w:tc>
+        <w:tc>
+          <w:tcPr>
+            <w:tcW w:type="dxa" w:w="1440"/>
+          </w:tcPr>
+          <w:p>
+            <w:r>
+              <w:t>data.ts, preprocessing</w:t>
+            </w:r>
+          </w:p>
+        </w:tc>
+        <w:tc>
+          <w:tcPr>
+            <w:tcW w:type="dxa" w:w="1440"/>
+          </w:tcPr>
+          <w:p>
+            <w:r>
+              <w:t>91</w:t>
             </w:r>
           </w:p>
         </w:tc>
@@ -856,12 +942,12 @@
     </w:p>
     <w:p>
       <w:r>
-        <w:t>Abbiamo costruito la base affidabile del motore decisionale. Tutti gli alert in Dashboard provengono da un unico motore che usa solo dati reali, spiega ogni segnalazione e ordina per priorita. La piattaforma non e ancora completa: servono la certificazione dei dati giocatore, la visualizzazione della coda e il bottone operativo.</w:t>
+        <w:t>Abbiamo costruito la base affidabile del motore decisionale. Tutti gli alert provengono da un unico motore con lookback storico, severity e category distinti, pipeline pura e testabile. La piattaforma non e ancora completa: servono la certificazione dei dati giocatore, la visualizzazione della coda e il bottone operativo.</w:t>
       </w:r>
     </w:p>
     <w:p>
       <w:r>
-        <w:t>Il lavoro del 20 luglio 2026 costituisce la fondazione tecnica per questi ultimi tasselli.</w:t>
+        <w:t>Il lavoro del 22 luglio 2026 completa la fase di stabilizzazione.</w:t>
       </w:r>
     </w:p>
     <w:p>
@@ -869,7 +955,7 @@
         <w:jc w:val="center"/>
       </w:pPr>
       <w:r>
-        <w:t>Documento generato dai commit GitHub — 20 luglio 2026</w:t>
+        <w:t>Documento generato dai commit GitHub — 22 luglio 2026</w:t>
       </w:r>
     </w:p>
     <w:sectPr>

</xml_diff>